<commit_message>
docs(makale): update paper draft, correction list, and add naive risk baselines
Adds M-09 naive baseline benchmarks (fault-distance-only, seismicity-only) for
comparison against the trained risk model, plus refreshed leaderboard and
YOLO ground-level notebook updates.

Co-Authored-By: Claude Sonnet 5 <noreply@anthropic.com>
Claude-Session: https://claude.ai/code/session_01GjxySvGno7VXvn8nLhzqnw
</commit_message>
<xml_diff>
--- a/makale/MAKALE_TASLAK_TR (1).docx
+++ b/makale/MAKALE_TASLAK_TR (1).docx
@@ -5679,10 +5679,10 @@
         <w:rPr>
           <w:highlight w:val="yellow"/>
         </w:rPr>
-        <w:t>[ÖLÇÜLECEK]</w:t>
-      </w:r>
-      <w:r>
-        <w:t>.</w:t>
+        <w:t>[GELECEK ÇALIŞMA]</w:t>
+      </w:r>
+      <w:r>
+        <w:t>; bu sürümde ölçülmesi beklenen bir eksiklik değil, planlı bir gelecek çalışma bileşenidir.</w:t>
       </w:r>
     </w:p>
     <w:p>
@@ -9222,6 +9222,12 @@
       </w:r>
     </w:p>
     <w:p>
+      <w:pPr/>
+      <w:r>
+        <w:t>Sınıflandırmada kullanılan Türkçe metin kümesinin künyesi şöyledir: kaynak, HuggingFace üzerinde özel (private) barındırılan deprem-private/intent_test_v13_anonymized kümesidir (erişim HF_TOKEN kimlik doğrulaması gerektirir); toplam 2 028 kayıt içerir ve tohum 42 ile rastgele %70/%15/%15 oranında eğitim/doğrulama/sınama olarak bölünmüştür (sırasıyla 1 418/305/305 kayıt) — Tablo 21'deki n_sınama = 305 değeri bu bölmeden gelmektedir. Kayıt zaman damgaları 12–14 Şubat 2023 aralığına düşmektedir, yani 6 Şubat 2023 depreminin hemen ardından toplanmış gerçek afet metinleridir. Etiketleyici alanı (labeler) kümenin tamamında tek bir değer taşımaktadır ("system_consensus"); bu, etiketlerin birden çok insan etiketleyici arasında karşılaştırılan bir süreçle değil, tek bir konsensüs mekanizmasıyla atandığı, dolayısıyla klasik anlamda bir etiketleyiciler arası uyum ölçütünün bu küme için hesaplanamayacağı anlamına gelir. Etiketleme yönergesi ve adlandırmadaki "anonymized" ibaresinin karşılık geldiği anonimleştirme yöntemi bu çalışma kapsamında ayrıca belgelenmemiştir; bu iki alan açık bir eksiklik olarak kaydedilmektedir. Kümenin erişim koşulu Veri Erişilebilirliği bölümünde belirtilmiştir.</w:t>
+      </w:r>
+    </w:p>
+    <w:p>
       <w:r>
         <w:t>Düşük güvenli kayıtların doğrudan elenmesi yerine belirsiz duruma alınması, bu sürümde yapılan bir tasarım değişikliğidir. Bölüm 4.5'te raporlanan iki yanlış negatif gözlemi, önceki sürümdeki eleme kuralının kategori bakımından asimetrik olmasından kaynaklanmıştır: kurtarma kuralı yalnızca yol ve ulaşım alanına ait anahtar sözcükler için tanımlıydı; sağlık, enkaz ve mahsur kalma terimleri için bir kurtarma yolu bulunmuyordu. Bu sürümde anahtar sözcük kurtarma kümesi beş üst kategorinin tamamını kapsayacak biçimde genişletilmiştir (sağlık alanı için "kan", "ilaç", "insülin", "nefes", "kanama", "yaralı"; enkaz alanı için "enkaz", "altında", "mahsur", "göçük", "ses geliyor"; ulaşım alanı için "yol", "köprü", "ulaşım", "kapalı", "geçemiyor").</w:t>
       </w:r>
@@ -10133,7 +10139,7 @@
         <w:rPr>
           <w:b/>
         </w:rPr>
-        <w:t>Bu bileşen deprem tahmini yapmamaktadır; ızgara hücreleri arasında göreli bir önceliklendirme üretir. Kullanılan 30 günlük zamansal pencere bir tahmin ufku değil, göreli sıralamanın geriye dönük olarak değerlendirildiği bir kalibrasyon penceresidir.</w:t>
+        <w:t>Bu bileşen deprem tahmini yapmamaktadır; katalog kayıtları arasında göreli bir önceliklendirme üretir. Kullanılan 30 günlük zamansal pencere bir tahmin ufku değil, göreli sıralamanın geriye dönük olarak değerlendirildiği bir kalibrasyon penceresidir.</w:t>
       </w:r>
       <w:r>
         <w:t xml:space="preserve"> Bu ayrım, kısa vadeli deprem tahmininin sismoloji yazınındaki tartışmalı konumu nedeniyle açıkça belirtilmektedir.</w:t>
@@ -10141,7 +10147,7 @@
     </w:p>
     <w:p>
       <w:r>
-        <w:t>Katalog verisi üzerinde kümelenmeden arındırma (declustering) bu sürümde uygulanmamıştır; bu sınırlılığın olası etkisi Bölüm 4.11'de tartışılmaktadır. Her ızgara hücresi için diri fay hattına en kısa mesafe, geçmiş sismisite yoğunluğu ve derinlik dağılımı öznitelik olarak hesaplanır. Sınıflandırıcı olarak CatBoost [48] kullanılmıştır (800 yineleme, derinlik 8, öğrenme oranı 0,03). Nihai skor, bu çıktının uzun vadeli tehlike ve fay yakınlığı bileşenleriyle ağırlıklı birleşimidir:</w:t>
+        <w:t>Katalog verisi üzerinde kümelenmeden arındırma (declustering) bu sürümde uygulanmamıştır; bu sınırlılığın olası etkisi Bölüm 4.11'de tartışılmaktadır. Katalogdaki her kayıt için diri fay hattına en kısa mesafe, geçmiş sismisite yoğunluğu ve derinlik dağılımı öznitelik olarak hesaplanır. Pozitif sınıf resmî olarak şöyle tanımlanır: katalogdaki i. kayıt için, kayıt zamanından itibaren 30 gün içinde ve kaydın konumundan 100 km yarıçap içinde büyüklüğü M ≥ 4,0 olan başka bir olay gerçekleşiyorsa y_i = 1, aksi hâlde y_i = 0'dır; analiz birimi bir uzamsal ızgara hücresi değil, katalogdaki bireysel deprem kaydıdır (bkz. Bölüm 4.11, n = 454). Sınıflandırıcı olarak CatBoost [48] kullanılmıştır (800 yineleme, derinlik 8, öğrenme oranı 0,03). Nihai skor, bu çıktının uzun vadeli tehlike ve fay yakınlığı bileşenleriyle ağırlıklı birleşimidir:</w:t>
       </w:r>
     </w:p>
     <w:p>
@@ -15493,15 +15499,8 @@
             <w:tcW w:w="311" w:type="pct"/>
           </w:tcPr>
           <w:p>
-            <w:pPr>
-              <w:spacing w:before="20" w:after="20"/>
-            </w:pPr>
-            <w:r>
-              <w:rPr>
-                <w:b/>
-                <w:sz w:val="15"/>
-              </w:rPr>
-              <w:t>0,4276</w:t>
+            <w:r>
+              <w:t>[KARŞILAŞTIRILAMAZ]*</w:t>
             </w:r>
           </w:p>
         </w:tc>
@@ -19239,15 +19238,8 @@
             <w:tcW w:w="833" w:type="pct"/>
           </w:tcPr>
           <w:p>
-            <w:pPr>
-              <w:spacing w:before="20" w:after="20"/>
-            </w:pPr>
-            <w:r>
-              <w:rPr>
-                <w:sz w:val="19"/>
-                <w:highlight w:val="yellow"/>
-              </w:rPr>
-              <w:t>[ÖLÇÜLECEK]</w:t>
+            <w:r>
+              <w:t>—</w:t>
             </w:r>
           </w:p>
         </w:tc>
@@ -19272,14 +19264,8 @@
             <w:tcW w:w="833" w:type="pct"/>
           </w:tcPr>
           <w:p>
-            <w:pPr>
-              <w:spacing w:before="20" w:after="20"/>
-            </w:pPr>
-            <w:r>
-              <w:rPr>
-                <w:sz w:val="19"/>
-              </w:rPr>
-              <w:t>Model çıkarımı içermez</w:t>
+            <w:r>
+              <w:t>Model çıkarımı içermediğinden gecikme bu kanal için ayrıca ölçülmemiştir</w:t>
             </w:r>
           </w:p>
         </w:tc>
@@ -27361,11 +27347,175 @@
           </w:p>
         </w:tc>
       </w:tr>
+      <w:tr>
+        <w:tc>
+          <w:tcPr>
+            <w:tcW w:type="dxa" w:w="1161"/>
+          </w:tcPr>
+          <w:p>
+            <w:r>
+              <w:t>Naif — Yalnızca fay mesafesi (R0a)</w:t>
+            </w:r>
+          </w:p>
+        </w:tc>
+        <w:tc>
+          <w:tcPr>
+            <w:tcW w:type="dxa" w:w="1161"/>
+          </w:tcPr>
+          <w:p>
+            <w:r>
+              <w:t>0,6364 ± 0,0748</w:t>
+            </w:r>
+          </w:p>
+        </w:tc>
+        <w:tc>
+          <w:tcPr>
+            <w:tcW w:type="dxa" w:w="1161"/>
+          </w:tcPr>
+          <w:p>
+            <w:r>
+              <w:t>0,7544</w:t>
+            </w:r>
+          </w:p>
+        </w:tc>
+        <w:tc>
+          <w:tcPr>
+            <w:tcW w:type="dxa" w:w="1161"/>
+          </w:tcPr>
+          <w:p>
+            <w:r>
+              <w:t>0,8539</w:t>
+            </w:r>
+          </w:p>
+        </w:tc>
+        <w:tc>
+          <w:tcPr>
+            <w:tcW w:type="dxa" w:w="1161"/>
+          </w:tcPr>
+          <w:p>
+            <w:r>
+              <w:t>0,6847</w:t>
+            </w:r>
+          </w:p>
+        </w:tc>
+        <w:tc>
+          <w:tcPr>
+            <w:tcW w:type="dxa" w:w="1161"/>
+          </w:tcPr>
+          <w:p>
+            <w:r>
+              <w:t>0,1830</w:t>
+            </w:r>
+          </w:p>
+        </w:tc>
+        <w:tc>
+          <w:tcPr>
+            <w:tcW w:type="dxa" w:w="1161"/>
+          </w:tcPr>
+          <w:p>
+            <w:r>
+              <w:t>0,4755</w:t>
+            </w:r>
+          </w:p>
+        </w:tc>
+        <w:tc>
+          <w:tcPr>
+            <w:tcW w:type="dxa" w:w="1161"/>
+          </w:tcPr>
+          <w:p>
+            <w:r>
+              <w:t>–</w:t>
+            </w:r>
+          </w:p>
+        </w:tc>
+      </w:tr>
+      <w:tr>
+        <w:tc>
+          <w:tcPr>
+            <w:tcW w:type="dxa" w:w="1161"/>
+          </w:tcPr>
+          <w:p>
+            <w:r>
+              <w:t>Naif — Yalnızca sismisite yoğunluğu (R0b)</w:t>
+            </w:r>
+          </w:p>
+        </w:tc>
+        <w:tc>
+          <w:tcPr>
+            <w:tcW w:type="dxa" w:w="1161"/>
+          </w:tcPr>
+          <w:p>
+            <w:r>
+              <w:t>0,5005 ± 0,0984</w:t>
+            </w:r>
+          </w:p>
+        </w:tc>
+        <w:tc>
+          <w:tcPr>
+            <w:tcW w:type="dxa" w:w="1161"/>
+          </w:tcPr>
+          <w:p>
+            <w:r>
+              <w:t>0,7255</w:t>
+            </w:r>
+          </w:p>
+        </w:tc>
+        <w:tc>
+          <w:tcPr>
+            <w:tcW w:type="dxa" w:w="1161"/>
+          </w:tcPr>
+          <w:p>
+            <w:r>
+              <w:t>0,5157</w:t>
+            </w:r>
+          </w:p>
+        </w:tc>
+        <w:tc>
+          <w:tcPr>
+            <w:tcW w:type="dxa" w:w="1161"/>
+          </w:tcPr>
+          <w:p>
+            <w:r>
+              <w:t>0,4852</w:t>
+            </w:r>
+          </w:p>
+        </w:tc>
+        <w:tc>
+          <w:tcPr>
+            <w:tcW w:type="dxa" w:w="1161"/>
+          </w:tcPr>
+          <w:p>
+            <w:r>
+              <w:t>0,3564</w:t>
+            </w:r>
+          </w:p>
+        </w:tc>
+        <w:tc>
+          <w:tcPr>
+            <w:tcW w:type="dxa" w:w="1161"/>
+          </w:tcPr>
+          <w:p>
+            <w:r>
+              <w:t>−0,0411</w:t>
+            </w:r>
+          </w:p>
+        </w:tc>
+        <w:tc>
+          <w:tcPr>
+            <w:tcW w:type="dxa" w:w="1161"/>
+          </w:tcPr>
+          <w:p>
+            <w:r>
+              <w:t>–</w:t>
+            </w:r>
+          </w:p>
+        </w:tc>
+      </w:tr>
     </w:tbl>
     <w:p/>
     <w:p>
       <w:r>
-        <w:t>Dört gözlem kaydedilmelidir.</w:t>
+        <w:t>Beş gözlem kaydedilmelidir.</w:t>
       </w:r>
     </w:p>
     <w:p>
@@ -27434,8 +27584,14 @@
       </w:r>
     </w:p>
     <w:p>
-      <w:r>
-        <w:t xml:space="preserve">Yukarıdaki dört gözlem </w:t>
+      <w:pPr/>
+      <w:r>
+        <w:t>Beşincisi, naif tabanlarla karşılaştırma modellerin kattığı değeri sınırlı ama gerçek göstermektedir. Yalnızca fay mesafesine dayalı sıralama (R0a) PR-AUC = 0,7544 (temel oranın 0,067 üzerinde) ve MCC = 0,4755 vermektedir; bu değer ROC-AUC'de üç öğrenilmiş modelin gerisinde kalsa da MCC'de LightGBM, yığınlanmış topluluk ve çok katmanlı algılayıcıdan daha iyidir. Yalnızca geçmiş sismisite yoğunluğuna (yedi günlük ortalama büyüklük) dayalı sıralama (R0b) ise ROC-AUC = 0,5005 ile rastgele düzeyi geçememektedir. Bu, öğrenilmiş modellerin kattığı değerin büyük ölçüde fay yakınlığı ötesindeki öznitelik bileşiminden geldiğini, buna karşın tek başına yakınlık sezgisinin gözden kaçırılmaması gereken güçlü bir taban oluşturduğunu göstermektedir.</w:t>
+      </w:r>
+    </w:p>
+    <w:p>
+      <w:r>
+        <w:t xml:space="preserve">Yukarıdaki beş gözlem </w:t>
       </w:r>
       <w:r>
         <w:t xml:space="preserve">Şekil </w:t>
@@ -29639,7 +29795,7 @@
     </w:p>
     <w:p>
       <w:r>
-        <w:t>Bu çalışmada kullanılan yer gerçeği verileri açık erişimlidir: Copernicus EMS EMSR648 aktivasyonuna ait AOI-04 ve AOI-11 hasar derecelendirme katmanları [8], Maxar Open Data Programı görüntüleri [46], Esri World Imagery Wayback arşivi [45], OpenAerialMap [47] ve OpenStreetMap yol ağı verisi [44]. Platform kaynak kodu, senaryo koşum yapılandırmaları ve koşum çıktıları [DEPO ADRESİ EKLENECEK] adresinde erişime açılacaktır.</w:t>
+        <w:t>Bu çalışmada kullanılan yer gerçeği verileri açık erişimlidir: Copernicus EMS EMSR648 aktivasyonuna ait AOI-04 ve AOI-11 hasar derecelendirme katmanları [8], Maxar Open Data Programı görüntüleri [46], Esri World Imagery Wayback arşivi [45], OpenAerialMap [47] ve OpenStreetMap yol ağı verisi [44]. Platform kaynak kodu, senaryo koşum yapılandırmaları ve koşum çıktıları [DEPO ADRESİ EKLENECEK] adresinde erişime açılacaktır. Bu kaynaklar, model eğitiminde ve yer gerçeği karşılaştırmasında kullanılan görüntüleri kapsar. Buna karşın canlı sistemin çalışma anındaki uydu karosu getirme bileşeni (QuakeMindBackend/apps/road_damage/utils/fetcher.py) varsayılan olarak Google karo sunucusundan (mt1.google.com/vt/lyrs=s) görüntü çekmektedir; bu, yukarıdaki eğitim/yer gerçeği kaynaklarından farklı ve ayrı bir kaynaktır. Kod paylaşıldığında bu ayrım açık olmalıdır: raporlanan model başarımı Maxar Open Data ve Esri World Imagery Wayback görüntüleri üzerinde ölçülmüştür; çalışma anında kullanılan Google karoları ayrı bir lisans rejimine tabidir ve bu koşum sonuçlarının bir parçası değildir. Bölüm 3.6'daki Türkçe metin sınıflandırması özel (private) bir küme kullanmaktadır: deprem-private/intent_test_v13_anonymized (HuggingFace, 2 028 kayıt; künye ve bölme ayrıntıları Bölüm 3.6'da verilmiştir). Bu küme, yukarıdaki açık kaynakların aksine kamuya açık değildir; erişim HuggingFace üzerinden kimlik doğrulamalı bir belirteç (HF_TOKEN) gerektirmektedir ve şu an genel erişime kapalıdır [ERİŞİM POLİTİKASI KARARLAŞTIRILACAK — açık/istek üzerine/kapalı].</w:t>
       </w:r>
     </w:p>
     <w:p>
@@ -29684,7 +29840,7 @@
     </w:p>
     <w:p>
       <w:r>
-        <w:t>[4] FEMA, "HAZUS Earthquake Model Technical Manual 4.2 SP3", Federal Emergency Management Agency, Washington DC, (2020).</w:t>
+        <w:t>[4] FEMA, "HAZUS Earthquake Model Technical Manual 4.2 SP3", Federal Emergency Management Agency, Washington DC, https://www.fema.gov/sites/default/files/2020-10/fema_hazus_earthquake_technical_manual_4-2.pdf, (2020).</w:t>
       </w:r>
     </w:p>
     <w:p>
@@ -29704,7 +29860,7 @@
     </w:p>
     <w:p>
       <w:r>
-        <w:t>[8] Copernicus Emergency Management Service, "EMSR648: Earthquake in Türkiye — Damage Grading Products, AOI-04 Kahramanmaraş and AOI-11 Hatay", European Commission, (2023).</w:t>
+        <w:t>[8] Copernicus Emergency Management Service, "EMSR648: Earthquake in Türkiye — Damage Grading Products, AOI-04 Kahramanmaraş and AOI-11 Hatay", European Commission, https://mapping.emergency.copernicus.eu/activations/EMSR648/, (2023).</w:t>
       </w:r>
     </w:p>
     <w:p>
@@ -29872,7 +30028,7 @@
     </w:p>
     <w:p>
       <w:r>
-        <w:t>[26] Huang, H., Liu, C., Zhang, D., Patel, S., Masalava, A., Sadak, S., Babolhavaeji, P., Low, W., Roozbahani, M. M., Frost, J. D., "EIDSeg: A pixel-level semantic segmentation dataset for post-earthquake damage assessment from social media images", Proceedings of the Fortieth AAAI Conference on Artificial Intelligence (AAAI-26), 38589-38597, arXiv:2511.06456, (2026).</w:t>
+        <w:t>[26] Huang, H., Liu, C., Zhang, D., Patel, S., Masalava, A., Sadak, S., Babolhavaeji, P., Low, W., Roozbahani, M. M., Frost, J. D., "EIDSeg: A pixel-level semantic segmentation dataset for post-earthquake damage assessment from social media images", Proceedings of the Fortieth AAAI Conference on Artificial Intelligence (AAAI-26), 38589-38597, arXiv:2511.06456, doi:10.48550/arXiv.2511.06456, (2026).</w:t>
       </w:r>
     </w:p>
     <w:p>
@@ -29904,12 +30060,12 @@
     </w:p>
     <w:p>
       <w:r>
-        <w:t>[30] HeiGIT, "Disaster openrouteservice to support the response efforts to the Türkiye/Syria earthquake", Heidelberg Institute for Geoinformation Technology, (2023).</w:t>
-      </w:r>
-    </w:p>
-    <w:p>
-      <w:r>
-        <w:t>[31] Kowsari, F., "Reliability boundaries under synthetic post-earthquake road disruption: A reproducible graph-based Monte Carlo study of emergency-response accessibility in Beykoz, Istanbul", Engineering Archive (engrXiv) preprint 7979, (2026).</w:t>
+        <w:t>[30] HeiGIT, "Disaster openrouteservice to support the response efforts to the Türkiye/Syria earthquake", Heidelberg Institute for Geoinformation Technology, https://heigit.org/disaster-openrouteservice-to-support-the-current-response-efforts-to-the-turkiye-syria-earthquake/, (2023).</w:t>
+      </w:r>
+    </w:p>
+    <w:p>
+      <w:r>
+        <w:t>[31] Kowsari, F., "Reliability boundaries under synthetic post-earthquake road disruption: A reproducible graph-based Monte Carlo study of emergency-response accessibility in Beykoz, Istanbul", Engineering Archive (engrXiv) preprint 7979, doi:10.31224/7979, (2026).</w:t>
       </w:r>
     </w:p>
     <w:p>
@@ -29996,7 +30152,7 @@
     </w:p>
     <w:p>
       <w:r>
-        <w:t>[40] Jocher, G., Chaurasia, A., Qiu, J., "Ultralytics YOLOv8", açık kaynak yazılım, (2023).</w:t>
+        <w:t>[40] Jocher, G., Chaurasia, A., Qiu, J., "Ultralytics YOLOv8", açık kaynak yazılım, https://github.com/ultralytics/ultralytics, (2023).</w:t>
       </w:r>
     </w:p>
     <w:p>
@@ -30063,7 +30219,7 @@
         <w:t>Advances in Neural Information Processing Systems (NeurIPS)</w:t>
       </w:r>
       <w:r>
-        <w:t>, 31: 6638-6648, (2018).</w:t>
+        <w:t>, 31: 6638-6648, doi:10.5555/3327757.3327770, (2018).</w:t>
       </w:r>
     </w:p>
     <w:p>
@@ -30077,7 +30233,7 @@
         <w:t>International Conference on Learning Representations (ICLR)</w:t>
       </w:r>
       <w:r>
-        <w:t>, (2019).</w:t>
+        <w:t>, arXiv:1711.05101, doi:10.48550/arXiv.1711.05101, (2019).</w:t>
       </w:r>
     </w:p>
     <w:p>
@@ -30146,7 +30302,7 @@
         <w:t>Advances in Neural Information Processing Systems (NeurIPS)</w:t>
       </w:r>
       <w:r>
-        <w:t>, 30: 3146-3154, (2017).</w:t>
+        <w:t>, 30: 3146-3154, doi:10.5555/3294996.3295074, (2017).</w:t>
       </w:r>
     </w:p>
     <w:p>

</xml_diff>